<commit_message>
docs: align CivicRecords with CivicSuite org transfer
</commit_message>
<xml_diff>
--- a/USER-MANUAL.docx
+++ b/USER-MANUAL.docx
@@ -1815,7 +1815,7 @@
     </w:p>
     <w:p>
       <w:r>
-        <w:t xml:space="preserve">git clone https://github.com/scottconverse/civicrecords-ai.git</w:t>
+        <w:t xml:space="preserve">git clone https://github.com/CivicSuite/civicrecords-ai.git</w:t>
       </w:r>
     </w:p>
     <w:p>
@@ -1850,7 +1850,7 @@
     </w:p>
     <w:p>
       <w:r>
-        <w:t xml:space="preserve">git clone https://github.com/scottconverse/civicrecords-ai.git</w:t>
+        <w:t xml:space="preserve">git clone https://github.com/CivicSuite/civicrecords-ai.git</w:t>
       </w:r>
     </w:p>
     <w:p>
@@ -6786,6 +6786,16 @@
     </w:p>
     <w:p>
       <w:r>
+        <w:t xml:space="preserve">!Deployment stack — entire system runs inside Docker Compose on the city's network. No cloud, no outbound by default.</w:t>
+      </w:r>
+    </w:p>
+    <w:p>
+      <w:r>
+        <w:t xml:space="preserve"/>
+      </w:r>
+    </w:p>
+    <w:p>
+      <w:r>
         <w:t xml:space="preserve">```mermaid</w:t>
       </w:r>
     </w:p>
@@ -7010,6 +7020,16 @@
     </w:p>
     <w:p>
       <w:r>
+        <w:t xml:space="preserve">!LLM call flow — records-ai application code routes through civiccore.llm (context assembly, template resolution, model registry, provider factory) to a local Ollama provider, with optional cloud providers behind opt-in extras.</w:t>
+      </w:r>
+    </w:p>
+    <w:p>
+      <w:r>
+        <w:t xml:space="preserve"/>
+      </w:r>
+    </w:p>
+    <w:p>
+      <w:r>
         <w:t xml:space="preserve">Hybrid search combines two retrieval strategies and merges them with reciprocal rank fusion:</w:t>
       </w:r>
     </w:p>
@@ -7185,6 +7205,16 @@
           <w:szCs w:val="36"/>
         </w:rPr>
         <w:t xml:space="preserve">C.8 Security Architecture</w:t>
+      </w:r>
+    </w:p>
+    <w:p>
+      <w:r>
+        <w:t xml:space="preserve"/>
+      </w:r>
+    </w:p>
+    <w:p>
+      <w:r>
+        <w:t xml:space="preserve">!Sovereignty boundary — all runtime components (FastAPI, Celery, Postgres+pgvector, Ollama, local volumes) live inside the city's on-prem network. No outbound by default; cloud is opt-in only. Connector credentials are encrypted at rest with Fernet.</w:t>
       </w:r>
     </w:p>
     <w:p>

</xml_diff>